<commit_message>
Agregado de documento sobre migracion a N capas
</commit_message>
<xml_diff>
--- a/TicketExpress_gedl/Analisis_NCapas_GermanDubon.docx
+++ b/TicketExpress_gedl/Analisis_NCapas_GermanDubon.docx
@@ -2,7 +2,468 @@
 <file path=word/document.xml><?xml version="1.0" encoding="utf-8"?>
 <w:document xmlns:wpc="http://schemas.microsoft.com/office/word/2010/wordprocessingCanvas" xmlns:cx="http://schemas.microsoft.com/office/drawing/2014/chartex" xmlns:cx1="http://schemas.microsoft.com/office/drawing/2015/9/8/chartex" xmlns:cx2="http://schemas.microsoft.com/office/drawing/2015/10/21/chartex" xmlns:cx3="http://schemas.microsoft.com/office/drawing/2016/5/9/chartex" xmlns:cx4="http://schemas.microsoft.com/office/drawing/2016/5/10/chartex" xmlns:cx5="http://schemas.microsoft.com/office/drawing/2016/5/11/chartex" xmlns:cx6="http://schemas.microsoft.com/office/drawing/2016/5/12/chartex" xmlns:cx7="http://schemas.microsoft.com/office/drawing/2016/5/13/chartex" xmlns:cx8="http://schemas.microsoft.com/office/drawing/2016/5/14/chartex" xmlns:mc="http://schemas.openxmlformats.org/markup-compatibility/2006" xmlns:aink="http://schemas.microsoft.com/office/drawing/2016/ink" xmlns:am3d="http://schemas.microsoft.com/office/drawing/2017/model3d" xmlns:o="urn:schemas-microsoft-com:office:office" xmlns:oel="http://schemas.microsoft.com/office/2019/extlst" xmlns:r="http://schemas.openxmlformats.org/officeDocument/2006/relationships" xmlns:m="http://schemas.openxmlformats.org/officeDocument/2006/math" xmlns:v="urn:schemas-microsoft-com:vml" xmlns:wp14="http://schemas.microsoft.com/office/word/2010/wordprocessingDrawing" xmlns:wp="http://schemas.openxmlformats.org/drawingml/2006/wordprocessingDrawing" xmlns:w10="urn:schemas-microsoft-com:office:word" xmlns:w="http://schemas.openxmlformats.org/wordprocessingml/2006/main" xmlns:w14="http://schemas.microsoft.com/office/word/2010/wordml" xmlns:w15="http://schemas.microsoft.com/office/word/2012/wordml" xmlns:w16cex="http://schemas.microsoft.com/office/word/2018/wordml/cex" xmlns:w16cid="http://schemas.microsoft.com/office/word/2016/wordml/cid" xmlns:w16="http://schemas.microsoft.com/office/word/2018/wordml" xmlns:w16du="http://schemas.microsoft.com/office/word/2023/wordml/word16du" xmlns:w16sdtdh="http://schemas.microsoft.com/office/word/2020/wordml/sdtdatahash" xmlns:w16sdtfl="http://schemas.microsoft.com/office/word/2024/wordml/sdtformatlock" xmlns:w16se="http://schemas.microsoft.com/office/word/2015/wordml/symex" xmlns:wpg="http://schemas.microsoft.com/office/word/2010/wordprocessingGroup" xmlns:wpi="http://schemas.microsoft.com/office/word/2010/wordprocessingInk" xmlns:wne="http://schemas.microsoft.com/office/word/2006/wordml" xmlns:wps="http://schemas.microsoft.com/office/word/2010/wordprocessingShape" mc:Ignorable="w14 w15 w16se w16cid w16 w16cex w16sdtdh w16sdtfl w16du wp14">
   <w:body>
-    <w:p/>
+    <w:p>
+      <w:pPr>
+        <w:rPr>
+          <w:b/>
+          <w:bCs/>
+          <w:lang w:val="es-HN"/>
+        </w:rPr>
+      </w:pPr>
+      <w:r>
+        <w:rPr>
+          <w:b/>
+          <w:bCs/>
+          <w:lang w:val="es-HN"/>
+        </w:rPr>
+        <w:t>Análisis de migración a N-Capas</w:t>
+      </w:r>
+    </w:p>
+    <w:p>
+      <w:pPr>
+        <w:rPr>
+          <w:lang w:val="es-HN"/>
+        </w:rPr>
+      </w:pPr>
+      <w:r>
+        <w:rPr>
+          <w:lang w:val="es-HN"/>
+        </w:rPr>
+        <w:t xml:space="preserve">Para migrarlo el </w:t>
+      </w:r>
+      <w:r>
+        <w:rPr>
+          <w:lang w:val="es-HN"/>
+        </w:rPr>
+        <w:t xml:space="preserve">proyecto </w:t>
+      </w:r>
+      <w:proofErr w:type="spellStart"/>
+      <w:r>
+        <w:rPr>
+          <w:lang w:val="es-HN"/>
+        </w:rPr>
+        <w:t>TicketExpress</w:t>
+      </w:r>
+      <w:proofErr w:type="spellEnd"/>
+      <w:r>
+        <w:rPr>
+          <w:lang w:val="es-HN"/>
+        </w:rPr>
+        <w:t xml:space="preserve"> </w:t>
+      </w:r>
+      <w:r>
+        <w:rPr>
+          <w:lang w:val="es-HN"/>
+        </w:rPr>
+        <w:t xml:space="preserve">que esta como </w:t>
+      </w:r>
+      <w:r>
+        <w:rPr>
+          <w:lang w:val="es-HN"/>
+        </w:rPr>
+        <w:t>MVC</w:t>
+      </w:r>
+      <w:r>
+        <w:rPr>
+          <w:lang w:val="es-HN"/>
+        </w:rPr>
+        <w:t xml:space="preserve"> se dividiría en </w:t>
+      </w:r>
+      <w:r>
+        <w:rPr>
+          <w:lang w:val="es-HN"/>
+        </w:rPr>
+        <w:t xml:space="preserve">Domain, </w:t>
+      </w:r>
+      <w:proofErr w:type="spellStart"/>
+      <w:r>
+        <w:rPr>
+          <w:lang w:val="es-HN"/>
+        </w:rPr>
+        <w:t>Application</w:t>
+      </w:r>
+      <w:proofErr w:type="spellEnd"/>
+      <w:r>
+        <w:rPr>
+          <w:lang w:val="es-HN"/>
+        </w:rPr>
+        <w:t xml:space="preserve">, </w:t>
+      </w:r>
+      <w:proofErr w:type="spellStart"/>
+      <w:r>
+        <w:rPr>
+          <w:lang w:val="es-HN"/>
+        </w:rPr>
+        <w:t>Infrastructure</w:t>
+      </w:r>
+      <w:proofErr w:type="spellEnd"/>
+      <w:r>
+        <w:rPr>
+          <w:lang w:val="es-HN"/>
+        </w:rPr>
+        <w:t xml:space="preserve"> y Api.</w:t>
+      </w:r>
+    </w:p>
+    <w:p>
+      <w:pPr>
+        <w:rPr>
+          <w:lang w:val="es-HN"/>
+        </w:rPr>
+      </w:pPr>
+      <w:r>
+        <w:rPr>
+          <w:lang w:val="es-HN"/>
+        </w:rPr>
+        <w:t>En la capa Domain irían las entidades principales Evento y Boleto</w:t>
+      </w:r>
+      <w:r>
+        <w:rPr>
+          <w:lang w:val="es-HN"/>
+        </w:rPr>
+        <w:t xml:space="preserve"> y también </w:t>
+      </w:r>
+      <w:r>
+        <w:rPr>
+          <w:lang w:val="es-HN"/>
+        </w:rPr>
+        <w:t xml:space="preserve">estarían las validaciones de estas entidades, por </w:t>
+      </w:r>
+      <w:r>
+        <w:rPr>
+          <w:lang w:val="es-HN"/>
+        </w:rPr>
+        <w:t>ejemplo,</w:t>
+      </w:r>
+      <w:r>
+        <w:rPr>
+          <w:lang w:val="es-HN"/>
+        </w:rPr>
+        <w:t xml:space="preserve"> </w:t>
+      </w:r>
+      <w:proofErr w:type="spellStart"/>
+      <w:r>
+        <w:rPr>
+          <w:lang w:val="es-HN"/>
+        </w:rPr>
+        <w:t>EventoValidator</w:t>
+      </w:r>
+      <w:proofErr w:type="spellEnd"/>
+      <w:r>
+        <w:rPr>
+          <w:lang w:val="es-HN"/>
+        </w:rPr>
+        <w:t xml:space="preserve"> y </w:t>
+      </w:r>
+      <w:proofErr w:type="spellStart"/>
+      <w:r>
+        <w:rPr>
+          <w:lang w:val="es-HN"/>
+        </w:rPr>
+        <w:t>BoletoValidator</w:t>
+      </w:r>
+      <w:proofErr w:type="spellEnd"/>
+      <w:r>
+        <w:rPr>
+          <w:lang w:val="es-HN"/>
+        </w:rPr>
+        <w:t>, que en eso</w:t>
+      </w:r>
+      <w:r>
+        <w:rPr>
+          <w:lang w:val="es-HN"/>
+        </w:rPr>
+        <w:t xml:space="preserve"> podría estar </w:t>
+      </w:r>
+      <w:proofErr w:type="spellStart"/>
+      <w:r>
+        <w:rPr>
+          <w:lang w:val="es-HN"/>
+        </w:rPr>
+        <w:t>TextNormalize</w:t>
+      </w:r>
+      <w:r>
+        <w:rPr>
+          <w:lang w:val="es-HN"/>
+        </w:rPr>
+        <w:t>r</w:t>
+      </w:r>
+      <w:proofErr w:type="spellEnd"/>
+      <w:r>
+        <w:rPr>
+          <w:lang w:val="es-HN"/>
+        </w:rPr>
+        <w:t xml:space="preserve"> </w:t>
+      </w:r>
+      <w:r>
+        <w:rPr>
+          <w:lang w:val="es-HN"/>
+        </w:rPr>
+        <w:t xml:space="preserve">que se usa para </w:t>
+      </w:r>
+      <w:r>
+        <w:rPr>
+          <w:lang w:val="es-HN"/>
+        </w:rPr>
+        <w:t xml:space="preserve">formatear los textos como </w:t>
+      </w:r>
+      <w:r>
+        <w:rPr>
+          <w:lang w:val="es-HN"/>
+        </w:rPr>
+        <w:t>nombres y ciudades.</w:t>
+      </w:r>
+    </w:p>
+    <w:p>
+      <w:pPr>
+        <w:rPr>
+          <w:lang w:val="es-HN"/>
+        </w:rPr>
+      </w:pPr>
+      <w:r>
+        <w:rPr>
+          <w:lang w:val="es-HN"/>
+        </w:rPr>
+        <w:t xml:space="preserve">En la capa </w:t>
+      </w:r>
+      <w:proofErr w:type="spellStart"/>
+      <w:r>
+        <w:rPr>
+          <w:lang w:val="es-HN"/>
+        </w:rPr>
+        <w:t>Application</w:t>
+      </w:r>
+      <w:proofErr w:type="spellEnd"/>
+      <w:r>
+        <w:rPr>
+          <w:lang w:val="es-HN"/>
+        </w:rPr>
+        <w:t xml:space="preserve"> irían los servicios como </w:t>
+      </w:r>
+      <w:proofErr w:type="spellStart"/>
+      <w:r>
+        <w:rPr>
+          <w:lang w:val="es-HN"/>
+        </w:rPr>
+        <w:t>EventoService</w:t>
+      </w:r>
+      <w:proofErr w:type="spellEnd"/>
+      <w:r>
+        <w:rPr>
+          <w:lang w:val="es-HN"/>
+        </w:rPr>
+        <w:t xml:space="preserve"> y </w:t>
+      </w:r>
+      <w:proofErr w:type="spellStart"/>
+      <w:r>
+        <w:rPr>
+          <w:lang w:val="es-HN"/>
+        </w:rPr>
+        <w:t>BoletoService</w:t>
+      </w:r>
+      <w:proofErr w:type="spellEnd"/>
+      <w:r>
+        <w:rPr>
+          <w:lang w:val="es-HN"/>
+        </w:rPr>
+        <w:t xml:space="preserve"> y </w:t>
+      </w:r>
+      <w:proofErr w:type="spellStart"/>
+      <w:r>
+        <w:rPr>
+          <w:lang w:val="es-HN"/>
+        </w:rPr>
+        <w:t>starían</w:t>
+      </w:r>
+      <w:proofErr w:type="spellEnd"/>
+      <w:r>
+        <w:rPr>
+          <w:lang w:val="es-HN"/>
+        </w:rPr>
+        <w:t xml:space="preserve"> las interfaces </w:t>
+      </w:r>
+      <w:proofErr w:type="spellStart"/>
+      <w:r>
+        <w:rPr>
+          <w:lang w:val="es-HN"/>
+        </w:rPr>
+        <w:t>IEventoRepository</w:t>
+      </w:r>
+      <w:proofErr w:type="spellEnd"/>
+      <w:r>
+        <w:rPr>
+          <w:lang w:val="es-HN"/>
+        </w:rPr>
+        <w:t xml:space="preserve"> e </w:t>
+      </w:r>
+      <w:proofErr w:type="spellStart"/>
+      <w:r>
+        <w:rPr>
+          <w:lang w:val="es-HN"/>
+        </w:rPr>
+        <w:t>IBoletoRepository</w:t>
+      </w:r>
+      <w:proofErr w:type="spellEnd"/>
+      <w:r>
+        <w:rPr>
+          <w:lang w:val="es-HN"/>
+        </w:rPr>
+        <w:t xml:space="preserve"> para manejar </w:t>
+      </w:r>
+      <w:r>
+        <w:rPr>
+          <w:lang w:val="es-HN"/>
+        </w:rPr>
+        <w:t>reglas como revisar si todavía hay boletos disponibles</w:t>
+      </w:r>
+      <w:r>
+        <w:rPr>
+          <w:lang w:val="es-HN"/>
+        </w:rPr>
+        <w:t xml:space="preserve">, también </w:t>
+      </w:r>
+      <w:r>
+        <w:rPr>
+          <w:lang w:val="es-HN"/>
+        </w:rPr>
+        <w:t>si el evento ya pasó o si un evento puede ser eliminado.</w:t>
+      </w:r>
+    </w:p>
+    <w:p>
+      <w:pPr>
+        <w:rPr>
+          <w:lang w:val="es-HN"/>
+        </w:rPr>
+      </w:pPr>
+      <w:r>
+        <w:rPr>
+          <w:lang w:val="es-HN"/>
+        </w:rPr>
+        <w:t xml:space="preserve">En la capa </w:t>
+      </w:r>
+      <w:proofErr w:type="spellStart"/>
+      <w:r>
+        <w:rPr>
+          <w:lang w:val="es-HN"/>
+        </w:rPr>
+        <w:t>Infrastructure</w:t>
+      </w:r>
+      <w:proofErr w:type="spellEnd"/>
+      <w:r>
+        <w:rPr>
+          <w:lang w:val="es-HN"/>
+        </w:rPr>
+        <w:t xml:space="preserve"> estaría </w:t>
+      </w:r>
+      <w:r>
+        <w:rPr>
+          <w:lang w:val="es-HN"/>
+        </w:rPr>
+        <w:t xml:space="preserve">las cosas relacionadas a </w:t>
+      </w:r>
+      <w:r>
+        <w:rPr>
+          <w:lang w:val="es-HN"/>
+        </w:rPr>
+        <w:t>la base de datos</w:t>
+      </w:r>
+      <w:r>
+        <w:rPr>
+          <w:lang w:val="es-HN"/>
+        </w:rPr>
+        <w:t>, dentro de ello estaría el</w:t>
+      </w:r>
+      <w:r>
+        <w:rPr>
+          <w:lang w:val="es-HN"/>
+        </w:rPr>
+        <w:t xml:space="preserve"> </w:t>
+      </w:r>
+      <w:proofErr w:type="spellStart"/>
+      <w:r>
+        <w:rPr>
+          <w:lang w:val="es-HN"/>
+        </w:rPr>
+        <w:t>TicketExpressDbContext</w:t>
+      </w:r>
+      <w:proofErr w:type="spellEnd"/>
+      <w:r>
+        <w:rPr>
+          <w:lang w:val="es-HN"/>
+        </w:rPr>
+        <w:t>.</w:t>
+      </w:r>
+    </w:p>
+    <w:p>
+      <w:pPr>
+        <w:rPr>
+          <w:lang w:val="es-HN"/>
+        </w:rPr>
+      </w:pPr>
+      <w:r>
+        <w:rPr>
+          <w:lang w:val="es-HN"/>
+        </w:rPr>
+        <w:t>En l</w:t>
+      </w:r>
+      <w:r>
+        <w:rPr>
+          <w:lang w:val="es-HN"/>
+        </w:rPr>
+        <w:t xml:space="preserve">a capa Api quedarían </w:t>
+      </w:r>
+      <w:r>
+        <w:rPr>
+          <w:lang w:val="es-HN"/>
+        </w:rPr>
+        <w:t xml:space="preserve">los archivos de </w:t>
+      </w:r>
+      <w:proofErr w:type="spellStart"/>
+      <w:r>
+        <w:rPr>
+          <w:lang w:val="es-HN"/>
+        </w:rPr>
+        <w:t>EventosController</w:t>
+      </w:r>
+      <w:proofErr w:type="spellEnd"/>
+      <w:r>
+        <w:rPr>
+          <w:lang w:val="es-HN"/>
+        </w:rPr>
+        <w:t xml:space="preserve">, </w:t>
+      </w:r>
+      <w:proofErr w:type="spellStart"/>
+      <w:r>
+        <w:rPr>
+          <w:lang w:val="es-HN"/>
+        </w:rPr>
+        <w:t>BoletosController</w:t>
+      </w:r>
+      <w:proofErr w:type="spellEnd"/>
+      <w:r>
+        <w:rPr>
+          <w:lang w:val="es-HN"/>
+        </w:rPr>
+        <w:t xml:space="preserve"> </w:t>
+      </w:r>
+      <w:r>
+        <w:rPr>
+          <w:lang w:val="es-HN"/>
+        </w:rPr>
+        <w:t xml:space="preserve">que se encargan recibir </w:t>
+      </w:r>
+      <w:r>
+        <w:rPr>
+          <w:lang w:val="es-HN"/>
+        </w:rPr>
+        <w:t>las solicitudes</w:t>
+      </w:r>
+      <w:r>
+        <w:rPr>
+          <w:lang w:val="es-HN"/>
+        </w:rPr>
+        <w:t>.</w:t>
+      </w:r>
+    </w:p>
     <w:sectPr>
       <w:pgSz w:w="12240" w:h="15840"/>
       <w:pgMar w:top="1440" w:right="1440" w:bottom="1440" w:left="1440" w:header="720" w:footer="720" w:gutter="0"/>
@@ -616,7 +1077,6 @@
   <w:style w:type="character" w:default="1" w:styleId="DefaultParagraphFont">
     <w:name w:val="Default Paragraph Font"/>
     <w:uiPriority w:val="1"/>
-    <w:semiHidden/>
     <w:unhideWhenUsed/>
   </w:style>
   <w:style w:type="table" w:default="1" w:styleId="TableNormal">

</xml_diff>